<commit_message>
Consentimiento: el Word de coordinación pasa a ser el documento de referencia
Se publica tal cual el fichero mantenido fuera del repositorio, en vez
de generarlo desde Markdown. Trae un cambio de fondo: el código de
emparejamiento ya no lo construye el alumnado con una regla
mnemotécnica, se lo asigna el docente.

Eso se propaga al protocolo, a la guía de Microsoft Forms y al primer
ítem del cuestionario. El protocolo añade además cómo custodiar la
lista que relaciona códigos con estudiantes, que mientras exista hace
reidentificables las respuestas.

Co-Authored-By: Claude Opus 5 <noreply@anthropic.com>
</commit_message>
<xml_diff>
--- a/descargas/cuestionario-autopercepcion.docx
+++ b/descargas/cuestionario-autopercepcion.docx
@@ -81,10 +81,7 @@
         </w:numPr>
       </w:pPr>
       <w:r>
-        <w:t xml:space="preserve">Código de emparejamiento (véase el protocolo;</w:t>
-      </w:r>
-      <w:r>
-        <w:t xml:space="preserve"> </w:t>
+        <w:t xml:space="preserve">El código que te dio tu docente al principio del curso (</w:t>
       </w:r>
       <w:r>
         <w:rPr>
@@ -97,7 +94,13 @@
         <w:t xml:space="preserve"> </w:t>
       </w:r>
       <w:r>
-        <w:t xml:space="preserve">nombre ni matrícula).</w:t>
+        <w:t xml:space="preserve">tu nombre ni tu</w:t>
+      </w:r>
+      <w:r>
+        <w:t xml:space="preserve"> </w:t>
+      </w:r>
+      <w:r>
+        <w:t xml:space="preserve">matrícula).</w:t>
       </w:r>
     </w:p>
     <w:p>

</xml_diff>

<commit_message>
Cuestionario sin hueco en los bloques y preguntas obligatorias
El bloque C era la escala de actitudes pendiente, que ya no se
incorpora: se retira y el uso declarado pasa a ser C, de modo que la
secuencia es A, B, C.

Y en Forms todas las preguntas van obligatorias: ninguna es
incontestable y las respuestas incompletas estropean la comparación
pre/post. La voluntariedad está en participar, no en dejar huecos.

Co-Authored-By: Claude Opus 5 <noreply@anthropic.com>
</commit_message>
<xml_diff>
--- a/descargas/cuestionario-autopercepcion.docx
+++ b/descargas/cuestionario-autopercepcion.docx
@@ -472,13 +472,13 @@
       </w:r>
     </w:p>
     <w:bookmarkEnd w:id="10"/>
-    <w:bookmarkStart w:id="12" w:name="bloque-d-uso-declarado"/>
+    <w:bookmarkStart w:id="12" w:name="bloque-c-uso-declarado"/>
     <w:p>
       <w:pPr>
         <w:pStyle w:val="Heading2"/>
       </w:pPr>
       <w:r>
-        <w:t xml:space="preserve">Bloque D. Uso declarado</w:t>
+        <w:t xml:space="preserve">Bloque C. Uso declarado</w:t>
       </w:r>
     </w:p>
     <w:p>

</xml_diff>